<commit_message>
Add Microsoft Forms and Lucidchart notes updates
</commit_message>
<xml_diff>
--- a/developer/dipesh-s394745/Week_7/Microsoft Form and Lucidchart Notes.docx
+++ b/developer/dipesh-s394745/Week_7/Microsoft Form and Lucidchart Notes.docx
@@ -110,15 +110,7 @@
           <w:bCs/>
           <w:lang w:val="en-US"/>
         </w:rPr>
-        <w:t>Creation of a form</w:t>
-      </w:r>
-      <w:r>
-        <w:rPr>
-          <w:b/>
-          <w:bCs/>
-          <w:lang w:val="en-US"/>
-        </w:rPr>
-        <w:t>:</w:t>
+        <w:t>Creation of a form:</w:t>
       </w:r>
       <w:r>
         <w:rPr>
@@ -145,15 +137,7 @@
           <w:bCs/>
           <w:lang w:val="en-US"/>
         </w:rPr>
-        <w:t xml:space="preserve">Types of questions </w:t>
-      </w:r>
-      <w:r>
-        <w:rPr>
-          <w:b/>
-          <w:bCs/>
-          <w:lang w:val="en-US"/>
-        </w:rPr>
-        <w:t>:</w:t>
+        <w:t>Types of questions :</w:t>
       </w:r>
       <w:r>
         <w:rPr>
@@ -204,15 +188,7 @@
           <w:bCs/>
           <w:lang w:val="en-US"/>
         </w:rPr>
-        <w:t xml:space="preserve">Sections </w:t>
-      </w:r>
-      <w:r>
-        <w:rPr>
-          <w:b/>
-          <w:bCs/>
-          <w:lang w:val="en-US"/>
-        </w:rPr>
-        <w:t>:</w:t>
+        <w:t>Sections :</w:t>
       </w:r>
       <w:r>
         <w:rPr>
@@ -239,15 +215,7 @@
           <w:bCs/>
           <w:lang w:val="en-US"/>
         </w:rPr>
-        <w:t xml:space="preserve">Logic </w:t>
-      </w:r>
-      <w:r>
-        <w:rPr>
-          <w:b/>
-          <w:bCs/>
-          <w:lang w:val="en-US"/>
-        </w:rPr>
-        <w:t>:</w:t>
+        <w:t>Logic :</w:t>
       </w:r>
       <w:r>
         <w:rPr>
@@ -274,15 +242,7 @@
           <w:bCs/>
           <w:lang w:val="en-US"/>
         </w:rPr>
-        <w:t xml:space="preserve">Themes </w:t>
-      </w:r>
-      <w:r>
-        <w:rPr>
-          <w:b/>
-          <w:bCs/>
-          <w:lang w:val="en-US"/>
-        </w:rPr>
-        <w:t>:</w:t>
+        <w:t>Themes :</w:t>
       </w:r>
       <w:r>
         <w:rPr>
@@ -309,15 +269,7 @@
           <w:bCs/>
           <w:lang w:val="en-US"/>
         </w:rPr>
-        <w:t xml:space="preserve">Sharing results </w:t>
-      </w:r>
-      <w:r>
-        <w:rPr>
-          <w:b/>
-          <w:bCs/>
-          <w:lang w:val="en-US"/>
-        </w:rPr>
-        <w:t>:</w:t>
+        <w:t>Sharing results :</w:t>
       </w:r>
       <w:r>
         <w:rPr>
@@ -402,6 +354,10 @@
     <w:p>
       <w:pPr>
         <w:pStyle w:val="ListParagraph"/>
+        <w:numPr>
+          <w:ilvl w:val="0"/>
+          <w:numId w:val="3"/>
+        </w:numPr>
         <w:jc w:val="both"/>
         <w:rPr>
           <w:lang w:val="en-US"/>
@@ -433,6 +389,10 @@
     <w:p>
       <w:pPr>
         <w:pStyle w:val="ListParagraph"/>
+        <w:numPr>
+          <w:ilvl w:val="0"/>
+          <w:numId w:val="3"/>
+        </w:numPr>
         <w:jc w:val="both"/>
         <w:rPr>
           <w:lang w:val="en-US"/>
@@ -464,6 +424,10 @@
     <w:p>
       <w:pPr>
         <w:pStyle w:val="ListParagraph"/>
+        <w:numPr>
+          <w:ilvl w:val="0"/>
+          <w:numId w:val="3"/>
+        </w:numPr>
         <w:jc w:val="both"/>
         <w:rPr>
           <w:lang w:val="en-US"/>
@@ -507,6 +471,10 @@
     <w:p>
       <w:pPr>
         <w:pStyle w:val="ListParagraph"/>
+        <w:numPr>
+          <w:ilvl w:val="0"/>
+          <w:numId w:val="3"/>
+        </w:numPr>
         <w:jc w:val="both"/>
         <w:rPr>
           <w:lang w:val="en-US"/>
@@ -550,6 +518,10 @@
     <w:p>
       <w:pPr>
         <w:pStyle w:val="ListParagraph"/>
+        <w:numPr>
+          <w:ilvl w:val="0"/>
+          <w:numId w:val="3"/>
+        </w:numPr>
         <w:jc w:val="both"/>
         <w:rPr>
           <w:lang w:val="en-US"/>
@@ -594,6 +566,10 @@
     <w:p>
       <w:pPr>
         <w:pStyle w:val="ListParagraph"/>
+        <w:numPr>
+          <w:ilvl w:val="0"/>
+          <w:numId w:val="3"/>
+        </w:numPr>
         <w:jc w:val="both"/>
         <w:rPr>
           <w:lang w:val="en-US"/>
@@ -637,6 +613,10 @@
     <w:p>
       <w:pPr>
         <w:pStyle w:val="ListParagraph"/>
+        <w:numPr>
+          <w:ilvl w:val="0"/>
+          <w:numId w:val="3"/>
+        </w:numPr>
         <w:jc w:val="both"/>
         <w:rPr>
           <w:bCs/>
@@ -648,14 +628,7 @@
           <w:b/>
           <w:lang w:val="en-US"/>
         </w:rPr>
-        <w:t xml:space="preserve">Layers &amp; Grouping </w:t>
-      </w:r>
-      <w:r>
-        <w:rPr>
-          <w:b/>
-          <w:lang w:val="en-US"/>
-        </w:rPr>
-        <w:t>:</w:t>
+        <w:t>Layers &amp; Grouping :</w:t>
       </w:r>
       <w:r>
         <w:rPr>
@@ -668,6 +641,10 @@
     <w:p>
       <w:pPr>
         <w:pStyle w:val="ListParagraph"/>
+        <w:numPr>
+          <w:ilvl w:val="0"/>
+          <w:numId w:val="3"/>
+        </w:numPr>
         <w:jc w:val="both"/>
         <w:rPr>
           <w:bCs/>
@@ -679,14 +656,7 @@
           <w:b/>
           <w:lang w:val="en-US"/>
         </w:rPr>
-        <w:t xml:space="preserve">Data linking </w:t>
-      </w:r>
-      <w:r>
-        <w:rPr>
-          <w:b/>
-          <w:lang w:val="en-US"/>
-        </w:rPr>
-        <w:t>:</w:t>
+        <w:t>Data linking :</w:t>
       </w:r>
       <w:r>
         <w:rPr>
@@ -699,6 +669,10 @@
     <w:p>
       <w:pPr>
         <w:pStyle w:val="ListParagraph"/>
+        <w:numPr>
+          <w:ilvl w:val="0"/>
+          <w:numId w:val="3"/>
+        </w:numPr>
         <w:jc w:val="both"/>
         <w:rPr>
           <w:bCs/>
@@ -710,14 +684,7 @@
           <w:b/>
           <w:lang w:val="en-US"/>
         </w:rPr>
-        <w:t xml:space="preserve">Integration </w:t>
-      </w:r>
-      <w:r>
-        <w:rPr>
-          <w:b/>
-          <w:lang w:val="en-US"/>
-        </w:rPr>
-        <w:t>:</w:t>
+        <w:t>Integration :</w:t>
       </w:r>
       <w:r>
         <w:rPr>
@@ -730,6 +697,10 @@
     <w:p>
       <w:pPr>
         <w:pStyle w:val="ListParagraph"/>
+        <w:numPr>
+          <w:ilvl w:val="0"/>
+          <w:numId w:val="3"/>
+        </w:numPr>
         <w:jc w:val="both"/>
         <w:rPr>
           <w:bCs/>
@@ -741,14 +712,7 @@
           <w:b/>
           <w:lang w:val="en-US"/>
         </w:rPr>
-        <w:t xml:space="preserve">Exporting </w:t>
-      </w:r>
-      <w:r>
-        <w:rPr>
-          <w:b/>
-          <w:lang w:val="en-US"/>
-        </w:rPr>
-        <w:t>:</w:t>
+        <w:t>Exporting :</w:t>
       </w:r>
       <w:r>
         <w:rPr>
@@ -860,6 +824,119 @@
     </w:lvl>
   </w:abstractNum>
   <w:abstractNum w:abstractNumId="1" w15:restartNumberingAfterBreak="0">
+    <w:nsid w:val="38252D01"/>
+    <w:multiLevelType w:val="hybridMultilevel"/>
+    <w:tmpl w:val="9A321226"/>
+    <w:lvl w:ilvl="0" w:tplc="0C090001">
+      <w:start w:val="1"/>
+      <w:numFmt w:val="bullet"/>
+      <w:lvlText w:val=""/>
+      <w:lvlJc w:val="left"/>
+      <w:pPr>
+        <w:ind w:left="1440" w:hanging="360"/>
+      </w:pPr>
+      <w:rPr>
+        <w:rFonts w:ascii="Symbol" w:hAnsi="Symbol" w:hint="default"/>
+      </w:rPr>
+    </w:lvl>
+    <w:lvl w:ilvl="1" w:tplc="0C090003" w:tentative="1">
+      <w:start w:val="1"/>
+      <w:numFmt w:val="bullet"/>
+      <w:lvlText w:val="o"/>
+      <w:lvlJc w:val="left"/>
+      <w:pPr>
+        <w:ind w:left="2160" w:hanging="360"/>
+      </w:pPr>
+      <w:rPr>
+        <w:rFonts w:ascii="Courier New" w:hAnsi="Courier New" w:cs="Courier New" w:hint="default"/>
+      </w:rPr>
+    </w:lvl>
+    <w:lvl w:ilvl="2" w:tplc="0C090005" w:tentative="1">
+      <w:start w:val="1"/>
+      <w:numFmt w:val="bullet"/>
+      <w:lvlText w:val=""/>
+      <w:lvlJc w:val="left"/>
+      <w:pPr>
+        <w:ind w:left="2880" w:hanging="360"/>
+      </w:pPr>
+      <w:rPr>
+        <w:rFonts w:ascii="Wingdings" w:hAnsi="Wingdings" w:hint="default"/>
+      </w:rPr>
+    </w:lvl>
+    <w:lvl w:ilvl="3" w:tplc="0C090001" w:tentative="1">
+      <w:start w:val="1"/>
+      <w:numFmt w:val="bullet"/>
+      <w:lvlText w:val=""/>
+      <w:lvlJc w:val="left"/>
+      <w:pPr>
+        <w:ind w:left="3600" w:hanging="360"/>
+      </w:pPr>
+      <w:rPr>
+        <w:rFonts w:ascii="Symbol" w:hAnsi="Symbol" w:hint="default"/>
+      </w:rPr>
+    </w:lvl>
+    <w:lvl w:ilvl="4" w:tplc="0C090003" w:tentative="1">
+      <w:start w:val="1"/>
+      <w:numFmt w:val="bullet"/>
+      <w:lvlText w:val="o"/>
+      <w:lvlJc w:val="left"/>
+      <w:pPr>
+        <w:ind w:left="4320" w:hanging="360"/>
+      </w:pPr>
+      <w:rPr>
+        <w:rFonts w:ascii="Courier New" w:hAnsi="Courier New" w:cs="Courier New" w:hint="default"/>
+      </w:rPr>
+    </w:lvl>
+    <w:lvl w:ilvl="5" w:tplc="0C090005" w:tentative="1">
+      <w:start w:val="1"/>
+      <w:numFmt w:val="bullet"/>
+      <w:lvlText w:val=""/>
+      <w:lvlJc w:val="left"/>
+      <w:pPr>
+        <w:ind w:left="5040" w:hanging="360"/>
+      </w:pPr>
+      <w:rPr>
+        <w:rFonts w:ascii="Wingdings" w:hAnsi="Wingdings" w:hint="default"/>
+      </w:rPr>
+    </w:lvl>
+    <w:lvl w:ilvl="6" w:tplc="0C090001" w:tentative="1">
+      <w:start w:val="1"/>
+      <w:numFmt w:val="bullet"/>
+      <w:lvlText w:val=""/>
+      <w:lvlJc w:val="left"/>
+      <w:pPr>
+        <w:ind w:left="5760" w:hanging="360"/>
+      </w:pPr>
+      <w:rPr>
+        <w:rFonts w:ascii="Symbol" w:hAnsi="Symbol" w:hint="default"/>
+      </w:rPr>
+    </w:lvl>
+    <w:lvl w:ilvl="7" w:tplc="0C090003" w:tentative="1">
+      <w:start w:val="1"/>
+      <w:numFmt w:val="bullet"/>
+      <w:lvlText w:val="o"/>
+      <w:lvlJc w:val="left"/>
+      <w:pPr>
+        <w:ind w:left="6480" w:hanging="360"/>
+      </w:pPr>
+      <w:rPr>
+        <w:rFonts w:ascii="Courier New" w:hAnsi="Courier New" w:cs="Courier New" w:hint="default"/>
+      </w:rPr>
+    </w:lvl>
+    <w:lvl w:ilvl="8" w:tplc="0C090005" w:tentative="1">
+      <w:start w:val="1"/>
+      <w:numFmt w:val="bullet"/>
+      <w:lvlText w:val=""/>
+      <w:lvlJc w:val="left"/>
+      <w:pPr>
+        <w:ind w:left="7200" w:hanging="360"/>
+      </w:pPr>
+      <w:rPr>
+        <w:rFonts w:ascii="Wingdings" w:hAnsi="Wingdings" w:hint="default"/>
+      </w:rPr>
+    </w:lvl>
+  </w:abstractNum>
+  <w:abstractNum w:abstractNumId="2" w15:restartNumberingAfterBreak="0">
     <w:nsid w:val="640D137C"/>
     <w:multiLevelType w:val="hybridMultilevel"/>
     <w:tmpl w:val="7E5ABF3C"/>
@@ -976,6 +1053,9 @@
     <w:abstractNumId w:val="0"/>
   </w:num>
   <w:num w:numId="2" w16cid:durableId="1295451775">
+    <w:abstractNumId w:val="2"/>
+  </w:num>
+  <w:num w:numId="3" w16cid:durableId="959342476">
     <w:abstractNumId w:val="1"/>
   </w:num>
 </w:numbering>

</xml_diff>